<commit_message>
Wire all 7 SQL queries into tool functions and update eval docs
- demand_tools.py: wire Q1 (event details), Q4 (comparable events / lift ratios), Q7 (cannibalization); fix discount_pct NULL handling in test
- supply_tools.py: wire Q3 (OOS history), Q5 (inventory snapshot at T-14)
- financial_tools.py: wire Q6 (unit economics at T-14)
- Baseline_Events_Parameterized.sql: add parameterized reference copy of all 7 queries (:event_id bind params, Q7 DECLARE blocks replaced with event_bounds CTE)
- generate_baseline_problems_doc.py + docx: update Q1-Q7 entries to reflect new column aliases (lift_p25/p50/p75, atp, lead_time_feasible, max_order_qty, sourcing_notes, event_duration_weeks, customer_margin, sku_id, baseline_demand) and Q2/Q7 design changes
- Remove Baseline Events (original hardcoded file, superseded by parameterized version)

Co-Authored-By: Claude Sonnet 4.6 <noreply@anthropic.com>
</commit_message>
<xml_diff>
--- a/docs/eval/CASCI_Baseline_Query_Problems.docx
+++ b/docs/eval/CASCI_Baseline_Query_Problems.docx
@@ -213,7 +213,7 @@
               <w:rPr>
                 <w:sz w:val="19"/>
               </w:rPr>
-              <w:t>Planned vs Actual Uplift</w:t>
+              <w:t>Pre-event Baseline Demand</w:t>
             </w:r>
           </w:p>
         </w:tc>
@@ -241,7 +241,7 @@
               <w:rPr>
                 <w:sz w:val="19"/>
               </w:rPr>
-              <w:t>What did the planner expect demand to look like at T-14 (14 days before the even...</w:t>
+              <w:t>What was the average weekly sales demand in the 8 weeks before the event — the s...</w:t>
             </w:r>
           </w:p>
         </w:tc>
@@ -595,7 +595,7 @@
         <w:rPr>
           <w:sz w:val="22"/>
         </w:rPr>
-        <w:t>Before any analysis can begin, the agent needs to know the exact scope of the event. Promotions in Blue Ridge span multiple product-location-customer combinations (tracked via event_prod_loc_cust_xref). Without this anchor, downstream queries have no join key and the agent cannot distinguish one event from another. This query also surfaces the planner's original intent — planned uplift, expected demand, and order quantity — which is the baseline against which AI recommendations are compared.</w:t>
+        <w:t>Before any analysis can begin, the agent needs to know the exact scope of the event. Promotions in Blue Ridge span multiple product-location-customer combinations (tracked via event_prod_loc_cust_xref). Without this anchor, downstream queries have no join key and the agent cannot distinguish one event from another. This query also surfaces the planner's original intent — planned uplift, expected demand, and order quantity — which is the baseline against which AI recommendations are compared. Column aliases are normalised for the Python tool layer: event.name is returned as deal_name, start_date and end_date are explicit aliases, and event_duration_weeks is derived alongside days. discount_pct is returned as NULL — it is not stored on the event or eplcx record in the current schema.</w:t>
       </w:r>
     </w:p>
     <w:p>
@@ -763,7 +763,20 @@
         <w:rPr>
           <w:sz w:val="21"/>
         </w:rPr>
-        <w:t>event_id, event_code, event_name, start_date, end_date, event_duration_days</w:t>
+        <w:t>event_id, event_code, deal_name, start_date, end_date</w:t>
+      </w:r>
+    </w:p>
+    <w:p>
+      <w:pPr>
+        <w:pStyle w:val="ListBullet"/>
+        <w:spacing w:after="40"/>
+        <w:ind w:left="360"/>
+      </w:pPr>
+      <w:r>
+        <w:rPr>
+          <w:sz w:val="21"/>
+        </w:rPr>
+        <w:t>event_duration_days, event_duration_weeks</w:t>
       </w:r>
     </w:p>
     <w:p>
@@ -802,7 +815,20 @@
         <w:rPr>
           <w:sz w:val="21"/>
         </w:rPr>
-        <w:t>planned_uplift_total, planned_demand_total, quantity_ordered</w:t>
+        <w:t>planned_uplift, planned_demand_total, quantity_ordered</w:t>
+      </w:r>
+    </w:p>
+    <w:p>
+      <w:pPr>
+        <w:pStyle w:val="ListBullet"/>
+        <w:spacing w:after="40"/>
+        <w:ind w:left="360"/>
+      </w:pPr>
+      <w:r>
+        <w:rPr>
+          <w:sz w:val="21"/>
+        </w:rPr>
+        <w:t>discount_pct (NULL — source column not present in current schema)</w:t>
       </w:r>
     </w:p>
     <w:p/>
@@ -856,7 +882,7 @@
         <w:rPr>
           <w:color w:val="1F3864"/>
         </w:rPr>
-        <w:t>Query 2 — Planned vs Actual Uplift</w:t>
+        <w:t>Query 2 — Pre-event Baseline Demand</w:t>
       </w:r>
     </w:p>
     <w:p>
@@ -877,7 +903,7 @@
           <w:i/>
           <w:sz w:val="22"/>
         </w:rPr>
-        <w:t>What did the planner expect demand to look like at T-14 (14 days before the event), and what actually happened week-by-week during the event window?</w:t>
+        <w:t>What was the average weekly sales demand in the 8 weeks before the event — the stable baseline that all three lift scenarios are multiplied against?</w:t>
       </w:r>
     </w:p>
     <w:p>
@@ -900,7 +926,7 @@
         <w:rPr>
           <w:sz w:val="22"/>
         </w:rPr>
-        <w:t>Promotional planning suffers from a common failure mode: the plan is set weeks in advance, but inventory decisions are made at T-14. By that point, the plan may already be stale. This query captures two views simultaneously: (1) the planned uplift as it existed in the system exactly 14 days before the event — using history tables to reconstruct the T-14 snapshot — and (2) the actual demand that materialized period-by-period from demand_history with signal='event'. The gap between these two views is where planning errors live. The Demand Decomposition Agent uses the actual branch to compute the pre-event baseline weekly average, which anchors all three lift scenarios.</w:t>
+        <w:t>Redesigned 2026-05-15: the original planned-vs-actual UNION approach was replaced with a focused 8-week trailing sales average. The change was driven by one insight: planned uplift is a planner guess, not a data signal. Scenarios are anchored to comparable event actuals from Query 4 (p25/p50/p75 lift ratios) — not to what the planner hoped would happen. Adding the planned branch introduced noise and a structural mismatch (event-signal demand vs sales-signal baseline). The new design is a three-CTE pipeline: event_plc narrows to the relevant prod_loc_cust rows, baseline_periods identifies the 8 weekly periods before event start, and weekly_totals sums across all PLCs per period. The final AVG gives one authoritative number: baseline_weekly_avg. This is the denominator in every lift calculation downstream. The query is already implemented directly in demand_tools.py.</w:t>
       </w:r>
     </w:p>
     <w:p>
@@ -925,7 +951,7 @@
         <w:rPr>
           <w:sz w:val="21"/>
         </w:rPr>
-        <w:t>event_prod_loc_cust_uplift_History</w:t>
+        <w:t>event</w:t>
       </w:r>
     </w:p>
     <w:p>
@@ -938,7 +964,7 @@
         <w:rPr>
           <w:sz w:val="21"/>
         </w:rPr>
-        <w:t>event_prod_loc_cust_xref_history</w:t>
+        <w:t>event_prod_loc_cust_xref</w:t>
       </w:r>
     </w:p>
     <w:p>
@@ -1016,7 +1042,7 @@
         <w:rPr>
           <w:sz w:val="21"/>
         </w:rPr>
-        <w:t>planned_uplift_units per period (from history at T-14)</w:t>
+        <w:t>baseline_weekly_avg — single float, average weekly sales units across 8 pre-event weeks</w:t>
       </w:r>
     </w:p>
     <w:p>
@@ -1029,7 +1055,7 @@
         <w:rPr>
           <w:sz w:val="21"/>
         </w:rPr>
-        <w:t>actual_event_demand per period (P1–P156 unpivoted)</w:t>
+        <w:t>Uses demand_signal = 'sales' only (not 'event' or 'lostsales')</w:t>
       </w:r>
     </w:p>
     <w:p>
@@ -1042,20 +1068,7 @@
         <w:rPr>
           <w:sz w:val="21"/>
         </w:rPr>
-        <w:t>baseline_weekly_avg derived from pre-event periods</w:t>
-      </w:r>
-    </w:p>
-    <w:p>
-      <w:pPr>
-        <w:pStyle w:val="ListBullet"/>
-        <w:spacing w:after="40"/>
-        <w:ind w:left="360"/>
-      </w:pPr>
-      <w:r>
-        <w:rPr>
-          <w:sz w:val="21"/>
-        </w:rPr>
-        <w:t>planned vs actual gap visible for post-event retrospective</w:t>
+        <w:t>Aggregates across all prod_loc_cust combinations for the event</w:t>
       </w:r>
     </w:p>
     <w:p/>
@@ -1092,7 +1105,7 @@
         <w:rPr>
           <w:sz w:val="22"/>
         </w:rPr>
-        <w:t>Provides the pre-event baseline weekly demand that all three scenario lift multipliers are applied to. Without this, the agent cannot compute Conservative / Moderate / Aggressive unit totals.</w:t>
+        <w:t>Provides the pre-event baseline weekly demand that all three scenario lift multipliers are applied against. Conservative = baseline × lift_p25 × weeks; Moderate = baseline × lift_p50 × weeks; Aggressive = baseline × lift_p75 × weeks.</w:t>
       </w:r>
     </w:p>
     <w:p>
@@ -1600,7 +1613,7 @@
         <w:rPr>
           <w:sz w:val="21"/>
         </w:rPr>
-        <w:t>conservative_lift_p25 — anchor for Conservative scenario</w:t>
+        <w:t>lift_p25 — anchor for Conservative scenario</w:t>
       </w:r>
     </w:p>
     <w:p>
@@ -1613,7 +1626,7 @@
         <w:rPr>
           <w:sz w:val="21"/>
         </w:rPr>
-        <w:t>moderate_lift_p50 — anchor for Moderate scenario (recommended default)</w:t>
+        <w:t>lift_p50 — anchor for Moderate scenario (recommended default)</w:t>
       </w:r>
     </w:p>
     <w:p>
@@ -1626,7 +1639,7 @@
         <w:rPr>
           <w:sz w:val="21"/>
         </w:rPr>
-        <w:t>aggressive_lift_p75 — anchor for Aggressive scenario</w:t>
+        <w:t>lift_p75 — anchor for Aggressive scenario</w:t>
       </w:r>
     </w:p>
     <w:p>
@@ -1879,7 +1892,7 @@
         <w:rPr>
           <w:sz w:val="21"/>
         </w:rPr>
-        <w:t>atp_at_t14 (BOH - reserved + on_order)</w:t>
+        <w:t>atp (BOH - reserved + on_order) at T-14</w:t>
       </w:r>
     </w:p>
     <w:p>
@@ -1892,7 +1905,7 @@
         <w:rPr>
           <w:sz w:val="21"/>
         </w:rPr>
-        <w:t>pl_lead_time_days, sn_quoted_lead_time, total_lead_time</w:t>
+        <w:t>lead_time_days (SN quoted_lead_time, fallback to pl_lead_time_days)</w:t>
       </w:r>
     </w:p>
     <w:p>
@@ -1905,7 +1918,7 @@
         <w:rPr>
           <w:sz w:val="21"/>
         </w:rPr>
-        <w:t>moq (minimum order quantity), maximum_order_units</w:t>
+        <w:t>moq (minimum order quantity), max_order_qty</w:t>
       </w:r>
     </w:p>
     <w:p>
@@ -1931,7 +1944,7 @@
         <w:rPr>
           <w:sz w:val="21"/>
         </w:rPr>
-        <w:t>is_prestage_feasible (1 / 0)</w:t>
+        <w:t>lead_time_feasible (1 / 0)</w:t>
       </w:r>
     </w:p>
     <w:p>
@@ -1944,7 +1957,7 @@
         <w:rPr>
           <w:sz w:val="21"/>
         </w:rPr>
-        <w:t>fulfillability_note — plain language label</w:t>
+        <w:t>sourcing_notes — plain language label</w:t>
       </w:r>
     </w:p>
     <w:p>
@@ -2236,7 +2249,7 @@
         <w:rPr>
           <w:sz w:val="21"/>
         </w:rPr>
-        <w:t>event_weeks (duration)</w:t>
+        <w:t>event_duration_weeks (derived from event start/end dates)</w:t>
       </w:r>
     </w:p>
     <w:p>
@@ -2250,6 +2263,19 @@
           <w:sz w:val="21"/>
         </w:rPr>
         <w:t>min_margin, max_margin (segment guardrails)</w:t>
+      </w:r>
+    </w:p>
+    <w:p>
+      <w:pPr>
+        <w:pStyle w:val="ListBullet"/>
+        <w:spacing w:after="40"/>
+        <w:ind w:left="360"/>
+      </w:pPr>
+      <w:r>
+        <w:rPr>
+          <w:sz w:val="21"/>
+        </w:rPr>
+        <w:t>customer_margin — (min_margin + max_margin) / 2.0</w:t>
       </w:r>
     </w:p>
     <w:p/>
@@ -2347,7 +2373,7 @@
         <w:rPr>
           <w:sz w:val="22"/>
         </w:rPr>
-        <w:t>Promotional lift is often partially an illusion: some of the 'extra' demand is customers switching from a similar product they would have bought anyway, not genuinely incremental volume. If the agent ignores cannibalization, it overstates net incremental demand and the planner over-orders. This query identifies substitute SKUs by matching on product_class_id at the same location, then computes each substitute's pre-event 8-week baseline and their actual sales during the event window. The cannibalization_factor is expressed as (actual_during / pre_baseline) - 1.0 — a negative number. If no historical data exists for a substitute, a conservative default of -20% is applied. The Demand Decomposition Agent surfaces these factors; the Scenario Generator incorporates them into the net incremental demand calculation and the final narrative.</w:t>
+        <w:t>Promotional lift is often partially an illusion: some of the 'extra' demand is customers switching from a similar product they would have bought anyway, not genuinely incremental volume. If the agent ignores cannibalization, it overstates net incremental demand and the planner over-orders. This query identifies substitute SKUs by matching on product_class_id at the same location, then computes each substitute's pre-event 8-week baseline and their actual sales during the event window. The cannibalization_factor is expressed as (actual_during / pre_baseline) - 1.0 — a negative number. If no historical data exists for a substitute, a conservative default of -20% is applied. Implementation note (2026-05-15): the original query used T-SQL DECLARE blocks (@event_id, @event_start, @event_end, @min_period, @max_period) which are incompatible with SQLAlchemy bind parameters. The query was rewritten using an event_bounds CTE to compute these values inline, preserving the same logic without DECLARE. The Demand Decomposition Agent surfaces these factors; the Scenario Generator incorporates them into the net incremental demand calculation and the final narrative.</w:t>
       </w:r>
     </w:p>
     <w:p>
@@ -2489,7 +2515,7 @@
         <w:rPr>
           <w:sz w:val="21"/>
         </w:rPr>
-        <w:t>sub_product_id, sub_product_code, sub_product_name</w:t>
+        <w:t>sku_id (sub_product_id alias), sub_product_code, sub_product_name</w:t>
       </w:r>
     </w:p>
     <w:p>
@@ -2515,7 +2541,7 @@
         <w:rPr>
           <w:sz w:val="21"/>
         </w:rPr>
-        <w:t>sub_pre_event_baseline (8-week avg before event)</w:t>
+        <w:t>baseline_demand (sub_pre_event_baseline alias — 8-week avg before event)</w:t>
       </w:r>
     </w:p>
     <w:p>

</xml_diff>